<commit_message>
Homologação: assinatura por link de pagamento Asaas (cobrança própria)
Co-Authored-By: Claude Opus 5.5 <noreply@anthropic.com>
Claude-Session: https://claude.ai/code/session_01LGkq3braMSrM85FQCLA9We
</commit_message>
<xml_diff>
--- a/homologacao/04-faq-template-nuvemshop.docx
+++ b/homologacao/04-faq-template-nuvemshop.docx
@@ -1112,6 +1112,41 @@
         <w:spacing w:after="120"/>
       </w:pPr>
       <w:r>
+        <w:rPr>
+          <w:b/>
+          <w:bCs/>
+        </w:rPr>
+        <w:t xml:space="preserve">Como o lojista paga:</w:t>
+      </w:r>
+      <w:r>
+        <w:t xml:space="preserve"> a cobrança é feita pela Miaou, fora da Nuvemshop. O lojista escolhe o plano na aba Planos e clica em </w:t>
+      </w:r>
+      <w:r>
+        <w:rPr>
+          <w:b/>
+          <w:bCs/>
+        </w:rPr>
+        <w:t xml:space="preserve">Falar com a Miaou</w:t>
+      </w:r>
+      <w:r>
+        <w:t xml:space="preserve">. A Miaou envia um link de pagamento do </w:t>
+      </w:r>
+      <w:r>
+        <w:rPr>
+          <w:b/>
+          <w:bCs/>
+        </w:rPr>
+        <w:t xml:space="preserve">Asaas</w:t>
+      </w:r>
+      <w:r>
+        <w:t xml:space="preserve"> e, com o pagamento confirmado, ativa o plano em até 24 horas. Para trocar ou cancelar, basta escrever para suporte@miaou.com.br.</w:t>
+      </w:r>
+    </w:p>
+    <w:p>
+      <w:pPr>
+        <w:spacing w:after="120"/>
+      </w:pPr>
+      <w:r>
         <w:t xml:space="preserve">Não há tarifa por venda, taxa por prova extra nem cobrança adicional. Quando as provas do mês acabam, o botão sai da loja até o dia 1º. O painel avisa quando 80% da cota é usada. Provas com erro não contam.</w:t>
       </w:r>
     </w:p>
@@ -1343,7 +1378,7 @@
         <w:spacing w:after="80"/>
       </w:pPr>
       <w:r>
-        <w:t xml:space="preserve">O lojista escolhe o plano na aba Planos. Com o plano ativo, o botão "Provar em mim" passa a aparecer nas páginas de produto.</w:t>
+        <w:t xml:space="preserve">O lojista escolhe o plano na aba Planos, clica em Falar com a Miaou e paga pelo link do Asaas que recebe por e-mail. Com o plano ativo (até 24 horas após o pagamento), o botão "Provar em mim" passa a aparecer nas páginas de produto.</w:t>
       </w:r>
     </w:p>
     <w:p>
@@ -1703,7 +1738,7 @@
         <w:t xml:space="preserve">Falar com a Miaou</w:t>
       </w:r>
       <w:r>
-        <w:t xml:space="preserve">. Assim que o plano é ativado, o uso do mês aparece no topo.</w:t>
+        <w:t xml:space="preserve">. Você recebe por e-mail o link de pagamento do Asaas. Com o pagamento confirmado, o plano é ativado em até 24 horas e o uso do mês aparece no topo.</w:t>
       </w:r>
     </w:p>
     <w:p>

</xml_diff>

<commit_message>
Homologação: remove planos e preços dos textos (por enquanto)
Co-Authored-By: Claude Opus 5.5 <noreply@anthropic.com>
Claude-Session: https://claude.ai/code/session_01LGkq3braMSrM85FQCLA9We
</commit_message>
<xml_diff>
--- a/homologacao/04-faq-template-nuvemshop.docx
+++ b/homologacao/04-faq-template-nuvemshop.docx
@@ -934,7 +934,7 @@
         <w:t xml:space="preserve">POC Comercial Exclusivo Nuvemshop Next:</w:t>
       </w:r>
       <w:r>
-        <w:t xml:space="preserve"> mesmo contato comercial, com SLA de até 24 horas. Há possibilidade de negociar condições para lojas com alto volume (plano Volume).</w:t>
+        <w:t xml:space="preserve"> mesmo contato comercial, com SLA de até 24 horas. Condições para lojas com alto volume são negociadas pelo contato comercial.</w:t>
       </w:r>
     </w:p>
     <w:p>
@@ -970,7 +970,7 @@
         <w:t xml:space="preserve">Loja de demonstração</w:t>
       </w:r>
       <w:r>
-        <w:t xml:space="preserve"> com o Miaou instalado e o plano Crescer ativo (400 provas/mês). URL e acesso enviados junto com os artefatos de homologação.</w:t>
+        <w:t xml:space="preserve"> com o Miaou instalado e já liberado. URL e acesso enviados junto com os artefatos de homologação.</w:t>
       </w:r>
     </w:p>
     <w:p>
@@ -990,7 +990,7 @@
         <w:t xml:space="preserve">Na loja da equipe Nuvemshop:</w:t>
       </w:r>
       <w:r>
-        <w:t xml:space="preserve"> depois de instalar o Miaou, envie o ID da loja para suporte@miaou.com.br e ativamos o plano Crescer sem custo em até 24 horas.</w:t>
+        <w:t xml:space="preserve"> depois de instalar o Miaou, envie o ID da loja para suporte@miaou.com.br e liberamos o provador sem custo em até 24 horas.</w:t>
       </w:r>
     </w:p>
     <w:p>
@@ -1014,97 +1014,7 @@
         <w:spacing w:after="120"/>
       </w:pPr>
       <w:r>
-        <w:t xml:space="preserve">Planos mensais, com uma quantidade de provas por mês. Os planos também aparecem na aba </w:t>
-      </w:r>
-      <w:r>
-        <w:rPr>
-          <w:b/>
-          <w:bCs/>
-        </w:rPr>
-        <w:t xml:space="preserve">Planos</w:t>
-      </w:r>
-      <w:r>
-        <w:t xml:space="preserve"> do painel do Miaou.</w:t>
-      </w:r>
-    </w:p>
-    <w:p>
-      <w:pPr>
-        <w:pStyle w:val="ListParagraph"/>
-        <w:numPr>
-          <w:ilvl w:val="0"/>
-          <w:numId w:val="2"/>
-        </w:numPr>
-        <w:spacing w:after="60"/>
-      </w:pPr>
-      <w:r>
-        <w:rPr>
-          <w:b/>
-          <w:bCs/>
-        </w:rPr>
-        <w:t xml:space="preserve">Essencial:</w:t>
-      </w:r>
-      <w:r>
-        <w:t xml:space="preserve"> R$ 97/mês, 150 provas.</w:t>
-      </w:r>
-    </w:p>
-    <w:p>
-      <w:pPr>
-        <w:pStyle w:val="ListParagraph"/>
-        <w:numPr>
-          <w:ilvl w:val="0"/>
-          <w:numId w:val="2"/>
-        </w:numPr>
-        <w:spacing w:after="60"/>
-      </w:pPr>
-      <w:r>
-        <w:rPr>
-          <w:b/>
-          <w:bCs/>
-        </w:rPr>
-        <w:t xml:space="preserve">Crescer:</w:t>
-      </w:r>
-      <w:r>
-        <w:t xml:space="preserve"> R$ 197/mês, 400 provas.</w:t>
-      </w:r>
-    </w:p>
-    <w:p>
-      <w:pPr>
-        <w:pStyle w:val="ListParagraph"/>
-        <w:numPr>
-          <w:ilvl w:val="0"/>
-          <w:numId w:val="2"/>
-        </w:numPr>
-        <w:spacing w:after="60"/>
-      </w:pPr>
-      <w:r>
-        <w:rPr>
-          <w:b/>
-          <w:bCs/>
-        </w:rPr>
-        <w:t xml:space="preserve">Escalar:</w:t>
-      </w:r>
-      <w:r>
-        <w:t xml:space="preserve"> R$ 497/mês, 1.200 provas e opção de remover a marca Miaou do provador.</w:t>
-      </w:r>
-    </w:p>
-    <w:p>
-      <w:pPr>
-        <w:pStyle w:val="ListParagraph"/>
-        <w:numPr>
-          <w:ilvl w:val="0"/>
-          <w:numId w:val="2"/>
-        </w:numPr>
-        <w:spacing w:after="60"/>
-      </w:pPr>
-      <w:r>
-        <w:rPr>
-          <w:b/>
-          <w:bCs/>
-        </w:rPr>
-        <w:t xml:space="preserve">Volume:</w:t>
-      </w:r>
-      <w:r>
-        <w:t xml:space="preserve"> R$ 997 (2.500 provas), R$ 1.497 (4.000), R$ 1.997 (6.000) ou R$ 2.997 (10.000) por mês.</w:t>
+        <w:t xml:space="preserve">Valores sob consulta pelo e-mail suporte@miaou.com.br (assunto "Comercial") ou pelo telefone (21) 97550-3749.</w:t>
       </w:r>
     </w:p>
     <w:p>
@@ -1116,10 +1026,10 @@
           <w:b/>
           <w:bCs/>
         </w:rPr>
-        <w:t xml:space="preserve">Como o lojista paga:</w:t>
-      </w:r>
-      <w:r>
-        <w:t xml:space="preserve"> a cobrança é feita pela Miaou, fora da Nuvemshop. O lojista escolhe o plano na aba Planos e clica em </w:t>
+        <w:t xml:space="preserve">Como o lojista contrata:</w:t>
+      </w:r>
+      <w:r>
+        <w:t xml:space="preserve"> a contratação é feita direto com a Miaou, fora da Nuvemshop. No painel, o lojista clica em </w:t>
       </w:r>
       <w:r>
         <w:rPr>
@@ -1129,17 +1039,15 @@
         <w:t xml:space="preserve">Falar com a Miaou</w:t>
       </w:r>
       <w:r>
-        <w:t xml:space="preserve">. A Miaou envia um link de pagamento do </w:t>
-      </w:r>
-      <w:r>
-        <w:rPr>
-          <w:b/>
-          <w:bCs/>
-        </w:rPr>
-        <w:t xml:space="preserve">Asaas</w:t>
-      </w:r>
-      <w:r>
-        <w:t xml:space="preserve"> e, com o pagamento confirmado, ativa o plano em até 24 horas. Para trocar ou cancelar, basta escrever para suporte@miaou.com.br.</w:t>
+        <w:t xml:space="preserve">, combina a contratação e a Miaou libera o provador na loja em até 24 horas. Não há tarifa por venda nem taxa de instalação.</w:t>
+      </w:r>
+    </w:p>
+    <w:p>
+      <w:pPr>
+        <w:pStyle w:val="Heading2"/>
+      </w:pPr>
+      <w:r>
+        <w:t xml:space="preserve">2.2. O aplicativo possui desconto para lojista Nuvemshop? Se sim, qual a porcentagem?</w:t>
       </w:r>
     </w:p>
     <w:p>
@@ -1147,7 +1055,7 @@
         <w:spacing w:after="120"/>
       </w:pPr>
       <w:r>
-        <w:t xml:space="preserve">Não há tarifa por venda, taxa por prova extra nem cobrança adicional. Quando as provas do mês acabam, o botão sai da loja até o dia 1º. O painel avisa quando 80% da cota é usada. Provas com erro não contam.</w:t>
+        <w:t xml:space="preserve">O Miaou é exclusivo para lojas Nuvemshop: as condições oferecidas já são as de lojista Nuvemshop.</w:t>
       </w:r>
     </w:p>
     <w:p>
@@ -1155,7 +1063,7 @@
         <w:pStyle w:val="Heading2"/>
       </w:pPr>
       <w:r>
-        <w:t xml:space="preserve">2.2. O aplicativo possui desconto para lojista Nuvemshop? Se sim, qual a porcentagem?</w:t>
+        <w:t xml:space="preserve">2.3. O aplicativo possui dias de trial? Se sim, quantos?</w:t>
       </w:r>
     </w:p>
     <w:p>
@@ -1163,7 +1071,7 @@
         <w:spacing w:after="120"/>
       </w:pPr>
       <w:r>
-        <w:t xml:space="preserve">O Miaou é exclusivo para lojas Nuvemshop, e os preços acima já são os de lojista Nuvemshop.</w:t>
+        <w:t xml:space="preserve">Não.</w:t>
       </w:r>
     </w:p>
     <w:p>
@@ -1171,7 +1079,7 @@
         <w:pStyle w:val="Heading2"/>
       </w:pPr>
       <w:r>
-        <w:t xml:space="preserve">2.3. O aplicativo possui dias de trial? Se sim, quantos?</w:t>
+        <w:t xml:space="preserve">2.4. O aplicativo possui taxa de setup? Se sim, qual o valor?</w:t>
       </w:r>
     </w:p>
     <w:p>
@@ -1179,7 +1087,7 @@
         <w:spacing w:after="120"/>
       </w:pPr>
       <w:r>
-        <w:t xml:space="preserve">Não. Para experimentar, recomendamos o plano Essencial.</w:t>
+        <w:t xml:space="preserve">Não.</w:t>
       </w:r>
     </w:p>
     <w:p>
@@ -1187,7 +1095,7 @@
         <w:pStyle w:val="Heading2"/>
       </w:pPr>
       <w:r>
-        <w:t xml:space="preserve">2.4. O aplicativo possui taxa de setup? Se sim, qual o valor?</w:t>
+        <w:t xml:space="preserve">2.5. O aplicativo possui precificação diferenciada para o lojista Nuvemshop Next?</w:t>
       </w:r>
     </w:p>
     <w:p>
@@ -1195,7 +1103,15 @@
         <w:spacing w:after="120"/>
       </w:pPr>
       <w:r>
-        <w:t xml:space="preserve">Não.</w:t>
+        <w:t xml:space="preserve">Não há condição própria. Lojas Next com alto volume podem negociar pelo contato comercial.</w:t>
+      </w:r>
+    </w:p>
+    <w:p>
+      <w:pPr>
+        <w:pStyle w:val="Heading1"/>
+      </w:pPr>
+      <w:r>
+        <w:t xml:space="preserve">3. Instalação</w:t>
       </w:r>
     </w:p>
     <w:p>
@@ -1203,7 +1119,7 @@
         <w:pStyle w:val="Heading2"/>
       </w:pPr>
       <w:r>
-        <w:t xml:space="preserve">2.5. O aplicativo possui precificação diferenciada para o lojista Nuvemshop Next?</w:t>
+        <w:t xml:space="preserve">3.1. URL da área de Login</w:t>
       </w:r>
     </w:p>
     <w:p>
@@ -1211,15 +1127,43 @@
         <w:spacing w:after="120"/>
       </w:pPr>
       <w:r>
-        <w:t xml:space="preserve">Não há tabela própria. Lojas Next com alto volume podem negociar o plano Volume pelo contato comercial.</w:t>
-      </w:r>
-    </w:p>
-    <w:p>
-      <w:pPr>
-        <w:pStyle w:val="Heading1"/>
-      </w:pPr>
-      <w:r>
-        <w:t xml:space="preserve">3. Instalação</w:t>
+        <w:t xml:space="preserve">Não há login separado. O acesso é sempre pelo admin da Nuvemshop: </w:t>
+      </w:r>
+      <w:r>
+        <w:rPr>
+          <w:b/>
+          <w:bCs/>
+        </w:rPr>
+        <w:t xml:space="preserve">Meus aplicativos &gt; Miaou</w:t>
+      </w:r>
+      <w:r>
+        <w:t xml:space="preserve">. O app abre o painel em https://app.miaou.com.br/admin já autenticado com a loja.</w:t>
+      </w:r>
+    </w:p>
+    <w:p>
+      <w:pPr>
+        <w:pStyle w:val="ListParagraph"/>
+        <w:numPr>
+          <w:ilvl w:val="0"/>
+          <w:numId w:val="2"/>
+        </w:numPr>
+        <w:spacing w:after="60"/>
+      </w:pPr>
+      <w:r>
+        <w:t xml:space="preserve">Se o painel mostrar "Sessão expirada", basta abrir o Miaou de novo pelo admin da Nuvemshop.</w:t>
+      </w:r>
+    </w:p>
+    <w:p>
+      <w:pPr>
+        <w:pStyle w:val="ListParagraph"/>
+        <w:numPr>
+          <w:ilvl w:val="0"/>
+          <w:numId w:val="2"/>
+        </w:numPr>
+        <w:spacing w:after="60"/>
+      </w:pPr>
+      <w:r>
+        <w:t xml:space="preserve">Não existe usuário nem senha do Miaou para criar ou recuperar.</w:t>
       </w:r>
     </w:p>
     <w:p>
@@ -1227,51 +1171,46 @@
         <w:pStyle w:val="Heading2"/>
       </w:pPr>
       <w:r>
-        <w:t xml:space="preserve">3.1. URL da área de Login</w:t>
-      </w:r>
-    </w:p>
-    <w:p>
-      <w:pPr>
-        <w:spacing w:after="120"/>
-      </w:pPr>
-      <w:r>
-        <w:t xml:space="preserve">Não há login separado. O acesso é sempre pelo admin da Nuvemshop: </w:t>
-      </w:r>
-      <w:r>
-        <w:rPr>
-          <w:b/>
-          <w:bCs/>
-        </w:rPr>
-        <w:t xml:space="preserve">Meus aplicativos &gt; Miaou</w:t>
-      </w:r>
-      <w:r>
-        <w:t xml:space="preserve">. O app abre o painel em https://app.miaou.com.br/admin já autenticado com a loja.</w:t>
-      </w:r>
-    </w:p>
-    <w:p>
-      <w:pPr>
-        <w:pStyle w:val="ListParagraph"/>
-        <w:numPr>
-          <w:ilvl w:val="0"/>
-          <w:numId w:val="2"/>
-        </w:numPr>
-        <w:spacing w:after="60"/>
-      </w:pPr>
-      <w:r>
-        <w:t xml:space="preserve">Se o painel mostrar "Sessão expirada", basta abrir o Miaou de novo pelo admin da Nuvemshop.</w:t>
-      </w:r>
-    </w:p>
-    <w:p>
-      <w:pPr>
-        <w:pStyle w:val="ListParagraph"/>
-        <w:numPr>
-          <w:ilvl w:val="0"/>
-          <w:numId w:val="2"/>
-        </w:numPr>
-        <w:spacing w:after="60"/>
-      </w:pPr>
-      <w:r>
-        <w:t xml:space="preserve">Não existe usuário nem senha do Miaou para criar ou recuperar.</w:t>
+        <w:t xml:space="preserve">3.2. Possui requisitos prévios para fazer a instalação? Se sim, quais são?</w:t>
+      </w:r>
+    </w:p>
+    <w:p>
+      <w:pPr>
+        <w:pStyle w:val="ListParagraph"/>
+        <w:numPr>
+          <w:ilvl w:val="0"/>
+          <w:numId w:val="2"/>
+        </w:numPr>
+        <w:spacing w:after="60"/>
+      </w:pPr>
+      <w:r>
+        <w:t xml:space="preserve">Loja Nuvemshop publicada no Brasil, com produtos com foto.</w:t>
+      </w:r>
+    </w:p>
+    <w:p>
+      <w:pPr>
+        <w:pStyle w:val="ListParagraph"/>
+        <w:numPr>
+          <w:ilvl w:val="0"/>
+          <w:numId w:val="2"/>
+        </w:numPr>
+        <w:spacing w:after="60"/>
+      </w:pPr>
+      <w:r>
+        <w:t xml:space="preserve">Não precisa de conta prévia, chave de API, código no tema nem configuração de usuário.</w:t>
+      </w:r>
+    </w:p>
+    <w:p>
+      <w:pPr>
+        <w:pStyle w:val="ListParagraph"/>
+        <w:numPr>
+          <w:ilvl w:val="0"/>
+          <w:numId w:val="2"/>
+        </w:numPr>
+        <w:spacing w:after="60"/>
+      </w:pPr>
+      <w:r>
+        <w:t xml:space="preserve">Permissões pedidas na instalação: ler produtos, ler pedidos e criar scripts na loja.</w:t>
       </w:r>
     </w:p>
     <w:p>
@@ -1279,53 +1218,6 @@
         <w:pStyle w:val="Heading2"/>
       </w:pPr>
       <w:r>
-        <w:t xml:space="preserve">3.2. Possui requisitos prévios para fazer a instalação? Se sim, quais são?</w:t>
-      </w:r>
-    </w:p>
-    <w:p>
-      <w:pPr>
-        <w:pStyle w:val="ListParagraph"/>
-        <w:numPr>
-          <w:ilvl w:val="0"/>
-          <w:numId w:val="2"/>
-        </w:numPr>
-        <w:spacing w:after="60"/>
-      </w:pPr>
-      <w:r>
-        <w:t xml:space="preserve">Loja Nuvemshop publicada no Brasil, com produtos com foto.</w:t>
-      </w:r>
-    </w:p>
-    <w:p>
-      <w:pPr>
-        <w:pStyle w:val="ListParagraph"/>
-        <w:numPr>
-          <w:ilvl w:val="0"/>
-          <w:numId w:val="2"/>
-        </w:numPr>
-        <w:spacing w:after="60"/>
-      </w:pPr>
-      <w:r>
-        <w:t xml:space="preserve">Não precisa de conta prévia, chave de API, código no tema nem configuração de usuário.</w:t>
-      </w:r>
-    </w:p>
-    <w:p>
-      <w:pPr>
-        <w:pStyle w:val="ListParagraph"/>
-        <w:numPr>
-          <w:ilvl w:val="0"/>
-          <w:numId w:val="2"/>
-        </w:numPr>
-        <w:spacing w:after="60"/>
-      </w:pPr>
-      <w:r>
-        <w:t xml:space="preserve">Permissões pedidas na instalação: ler produtos, ler pedidos e criar scripts na loja.</w:t>
-      </w:r>
-    </w:p>
-    <w:p>
-      <w:pPr>
-        <w:pStyle w:val="Heading2"/>
-      </w:pPr>
-      <w:r>
         <w:t xml:space="preserve">3.3. Como é o processo de instalação e liberação do aplicativo?</w:t>
       </w:r>
     </w:p>
@@ -1378,7 +1270,7 @@
         <w:spacing w:after="80"/>
       </w:pPr>
       <w:r>
-        <w:t xml:space="preserve">O lojista escolhe o plano na aba Planos, clica em Falar com a Miaou e paga pelo link do Asaas que recebe por e-mail. Com o plano ativo (até 24 horas após o pagamento), o botão "Provar em mim" passa a aparecer nas páginas de produto.</w:t>
+        <w:t xml:space="preserve">O lojista clica em Falar com a Miaou no painel e combina a contratação. Com a loja liberada (até 24 horas), o botão "Provar em mim" passa a aparecer nas páginas de produto.</w:t>
       </w:r>
     </w:p>
     <w:p>
@@ -1718,17 +1610,7 @@
         <w:spacing w:after="80"/>
       </w:pPr>
       <w:r>
-        <w:t xml:space="preserve">Abra </w:t>
-      </w:r>
-      <w:r>
-        <w:rPr>
-          <w:b/>
-          <w:bCs/>
-        </w:rPr>
-        <w:t xml:space="preserve">Planos</w:t>
-      </w:r>
-      <w:r>
-        <w:t xml:space="preserve">, escolha o plano e clique em </w:t>
+        <w:t xml:space="preserve">No painel, clique em </w:t>
       </w:r>
       <w:r>
         <w:rPr>
@@ -1738,7 +1620,30 @@
         <w:t xml:space="preserve">Falar com a Miaou</w:t>
       </w:r>
       <w:r>
-        <w:t xml:space="preserve">. Você recebe por e-mail o link de pagamento do Asaas. Com o pagamento confirmado, o plano é ativado em até 24 horas e o uso do mês aparece no topo.</w:t>
+        <w:t xml:space="preserve"> para combinar a contratação. A Miaou libera o provador na sua loja em até 24 horas.</w:t>
+      </w:r>
+    </w:p>
+    <w:p>
+      <w:pPr>
+        <w:pStyle w:val="ListParagraph"/>
+        <w:numPr>
+          <w:ilvl w:val="0"/>
+          <w:numId w:val="4"/>
+        </w:numPr>
+        <w:spacing w:after="80"/>
+      </w:pPr>
+      <w:r>
+        <w:t xml:space="preserve">(Opcional) Em </w:t>
+      </w:r>
+      <w:r>
+        <w:rPr>
+          <w:b/>
+          <w:bCs/>
+        </w:rPr>
+        <w:t xml:space="preserve">Preferências</w:t>
+      </w:r>
+      <w:r>
+        <w:t xml:space="preserve">, ajuste o texto do botão, o pedido de WhatsApp e o limite de provas por comprador.</w:t>
       </w:r>
     </w:p>
     <w:p>
@@ -1751,7 +1656,7 @@
           <wp:inline distT="0" distB="0" distL="0" distR="0">
             <wp:extent cx="5715000" cy="3571875"/>
             <wp:effectExtent t="0" r="0" b="0" l="0"/>
-            <wp:docPr id="1" name="admin-plan.jpg" descr="Planos: plano ativo, uso do mês e opções" title="Planos: plano ativo, uso do mês e opções"/>
+            <wp:docPr id="1" name="admin-prefs.jpg" descr="Preferências: botão na loja e pedido de WhatsApp" title="Preferências: botão na loja e pedido de WhatsApp"/>
             <wp:cNvGraphicFramePr>
               <a:graphicFrameLocks xmlns:a="http://schemas.openxmlformats.org/drawingml/2006/main" noChangeAspect="1"/>
             </wp:cNvGraphicFramePr>
@@ -1800,7 +1705,7 @@
           <w:sz w:val="18"/>
           <w:szCs w:val="18"/>
         </w:rPr>
-        <w:t xml:space="preserve">Planos: plano ativo, uso do mês e opções</w:t>
+        <w:t xml:space="preserve">Preferências: botão na loja e pedido de WhatsApp</w:t>
       </w:r>
     </w:p>
     <w:p>
@@ -1813,17 +1718,405 @@
         <w:spacing w:after="80"/>
       </w:pPr>
       <w:r>
-        <w:t xml:space="preserve">(Opcional) Em </w:t>
-      </w:r>
-      <w:r>
-        <w:rPr>
-          <w:b/>
-          <w:bCs/>
-        </w:rPr>
-        <w:t xml:space="preserve">Preferências</w:t>
-      </w:r>
-      <w:r>
-        <w:t xml:space="preserve">, ajuste o texto do botão, o pedido de WhatsApp e o limite de provas por comprador.</w:t>
+        <w:t xml:space="preserve">Abra um produto da sua loja: o botão </w:t>
+      </w:r>
+      <w:r>
+        <w:rPr>
+          <w:b/>
+          <w:bCs/>
+        </w:rPr>
+        <w:t xml:space="preserve">"Provar em mim"</w:t>
+      </w:r>
+      <w:r>
+        <w:t xml:space="preserve"> aparece abaixo do "Comprar". Faça uma prova para conferir.</w:t>
+      </w:r>
+    </w:p>
+    <w:p>
+      <w:pPr>
+        <w:pStyle w:val="Heading3"/>
+      </w:pPr>
+      <w:r>
+        <w:t xml:space="preserve">3.5.3. Direcionamento para o suporte do aplicativo</w:t>
+      </w:r>
+    </w:p>
+    <w:p>
+      <w:pPr>
+        <w:spacing w:after="120"/>
+      </w:pPr>
+      <w:r>
+        <w:t xml:space="preserve">Dúvidas na instalação: e-mail </w:t>
+      </w:r>
+      <w:r>
+        <w:rPr>
+          <w:b/>
+          <w:bCs/>
+        </w:rPr>
+        <w:t xml:space="preserve">suporte@miaou.com.br</w:t>
+      </w:r>
+      <w:r>
+        <w:t xml:space="preserve"> ou telefone </w:t>
+      </w:r>
+      <w:r>
+        <w:rPr>
+          <w:b/>
+          <w:bCs/>
+        </w:rPr>
+        <w:t xml:space="preserve">(21) 97550-3749</w:t>
+      </w:r>
+      <w:r>
+        <w:t xml:space="preserve">, de segunda a sexta, das 9h às 18h, com resposta em até 24 horas. No painel, o botão </w:t>
+      </w:r>
+      <w:r>
+        <w:rPr>
+          <w:b/>
+          <w:bCs/>
+        </w:rPr>
+        <w:t xml:space="preserve">Falar com a Miaou</w:t>
+      </w:r>
+      <w:r>
+        <w:t xml:space="preserve"> abre o e-mail já com o número da loja.</w:t>
+      </w:r>
+    </w:p>
+    <w:p>
+      <w:pPr>
+        <w:pStyle w:val="Heading3"/>
+      </w:pPr>
+      <w:r>
+        <w:t xml:space="preserve">3.5.4. Considerações Gerais</w:t>
+      </w:r>
+    </w:p>
+    <w:p>
+      <w:pPr>
+        <w:pStyle w:val="ListParagraph"/>
+        <w:numPr>
+          <w:ilvl w:val="0"/>
+          <w:numId w:val="2"/>
+        </w:numPr>
+        <w:spacing w:after="60"/>
+      </w:pPr>
+      <w:r>
+        <w:rPr>
+          <w:b/>
+          <w:bCs/>
+        </w:rPr>
+        <w:t xml:space="preserve">O botão não apareceu:</w:t>
+      </w:r>
+      <w:r>
+        <w:t xml:space="preserve"> confira se sua loja já foi liberada pela Miaou, se o provador está ligado em Preferências e se o produto tem foto.</w:t>
+      </w:r>
+    </w:p>
+    <w:p>
+      <w:pPr>
+        <w:pStyle w:val="ListParagraph"/>
+        <w:numPr>
+          <w:ilvl w:val="0"/>
+          <w:numId w:val="2"/>
+        </w:numPr>
+        <w:spacing w:after="60"/>
+      </w:pPr>
+      <w:r>
+        <w:rPr>
+          <w:b/>
+          <w:bCs/>
+        </w:rPr>
+        <w:t xml:space="preserve">Loja com domínio próprio novo:</w:t>
+      </w:r>
+      <w:r>
+        <w:t xml:space="preserve"> abra o painel do Miaou uma vez para ele atualizar os endereços da loja.</w:t>
+      </w:r>
+    </w:p>
+    <w:p>
+      <w:pPr>
+        <w:pStyle w:val="ListParagraph"/>
+        <w:numPr>
+          <w:ilvl w:val="0"/>
+          <w:numId w:val="2"/>
+        </w:numPr>
+        <w:spacing w:after="60"/>
+      </w:pPr>
+      <w:r>
+        <w:rPr>
+          <w:b/>
+          <w:bCs/>
+        </w:rPr>
+        <w:t xml:space="preserve">"Sessão expirada" no painel:</w:t>
+      </w:r>
+      <w:r>
+        <w:t xml:space="preserve"> abra o app de novo pelo admin da Nuvemshop (Meus aplicativos &gt; Miaou).</w:t>
+      </w:r>
+    </w:p>
+    <w:p>
+      <w:pPr>
+        <w:pStyle w:val="ListParagraph"/>
+        <w:numPr>
+          <w:ilvl w:val="0"/>
+          <w:numId w:val="2"/>
+        </w:numPr>
+        <w:spacing w:after="60"/>
+      </w:pPr>
+      <w:r>
+        <w:rPr>
+          <w:b/>
+          <w:bCs/>
+        </w:rPr>
+        <w:t xml:space="preserve">Produto novo não aparece em Produtos:</w:t>
+      </w:r>
+      <w:r>
+        <w:t xml:space="preserve"> ele chega sozinho em alguns segundos; se não chegar, use Sincronizar catálogo.</w:t>
+      </w:r>
+    </w:p>
+    <w:p>
+      <w:pPr>
+        <w:pStyle w:val="ListParagraph"/>
+        <w:numPr>
+          <w:ilvl w:val="0"/>
+          <w:numId w:val="2"/>
+        </w:numPr>
+        <w:spacing w:after="60"/>
+      </w:pPr>
+      <w:r>
+        <w:rPr>
+          <w:b/>
+          <w:bCs/>
+        </w:rPr>
+        <w:t xml:space="preserve">Desinstalação:</w:t>
+      </w:r>
+      <w:r>
+        <w:t xml:space="preserve"> em Meus aplicativos, clique em Desinstalar. O botão sai da loja na hora. Ao reinstalar, o histórico e as preferências voltam.</w:t>
+      </w:r>
+    </w:p>
+    <w:p>
+      <w:pPr>
+        <w:pStyle w:val="Heading1"/>
+      </w:pPr>
+      <w:r>
+        <w:t xml:space="preserve">4. Funcionamento</w:t>
+      </w:r>
+    </w:p>
+    <w:p>
+      <w:pPr>
+        <w:pStyle w:val="Heading2"/>
+      </w:pPr>
+      <w:r>
+        <w:t xml:space="preserve">4.1. Como a ferramenta funciona: configuração e funcionalidades</w:t>
+      </w:r>
+    </w:p>
+    <w:p>
+      <w:pPr>
+        <w:pStyle w:val="Heading3"/>
+      </w:pPr>
+      <w:r>
+        <w:t xml:space="preserve">Na loja (comprador)</w:t>
+      </w:r>
+    </w:p>
+    <w:p>
+      <w:pPr>
+        <w:pStyle w:val="ListParagraph"/>
+        <w:numPr>
+          <w:ilvl w:val="0"/>
+          <w:numId w:val="2"/>
+        </w:numPr>
+        <w:spacing w:after="60"/>
+      </w:pPr>
+      <w:r>
+        <w:t xml:space="preserve">Botão </w:t>
+      </w:r>
+      <w:r>
+        <w:rPr>
+          <w:b/>
+          <w:bCs/>
+        </w:rPr>
+        <w:t xml:space="preserve">"Provar em mim"</w:t>
+      </w:r>
+      <w:r>
+        <w:t xml:space="preserve"> abaixo do "Comprar", em qualquer layout. No celular, o provador abre em janela; no computador, em gaveta lateral.</w:t>
+      </w:r>
+    </w:p>
+    <w:p>
+      <w:pPr>
+        <w:pStyle w:val="ListParagraph"/>
+        <w:numPr>
+          <w:ilvl w:val="0"/>
+          <w:numId w:val="2"/>
+        </w:numPr>
+        <w:spacing w:after="60"/>
+      </w:pPr>
+      <w:r>
+        <w:t xml:space="preserve">O comprador envia uma foto ou tira na hora (câmera traseira para roupas, selfie para óculos). A foto é reduzida no próprio aparelho antes do envio.</w:t>
+      </w:r>
+    </w:p>
+    <w:p>
+      <w:pPr>
+        <w:pStyle w:val="ListParagraph"/>
+        <w:numPr>
+          <w:ilvl w:val="0"/>
+          <w:numId w:val="2"/>
+        </w:numPr>
+        <w:spacing w:after="60"/>
+      </w:pPr>
+      <w:r>
+        <w:t xml:space="preserve">A prova fica pronta em cerca de 20 segundos, com o rosto e o fundo da foto original.</w:t>
+      </w:r>
+    </w:p>
+    <w:p>
+      <w:pPr>
+        <w:pStyle w:val="ListParagraph"/>
+        <w:numPr>
+          <w:ilvl w:val="0"/>
+          <w:numId w:val="2"/>
+        </w:numPr>
+        <w:spacing w:after="60"/>
+      </w:pPr>
+      <w:r>
+        <w:t xml:space="preserve">A foto fica guardada por 24 horas: a segunda peça já começa sem novo envio.</w:t>
+      </w:r>
+    </w:p>
+    <w:p>
+      <w:pPr>
+        <w:pStyle w:val="ListParagraph"/>
+        <w:numPr>
+          <w:ilvl w:val="0"/>
+          <w:numId w:val="2"/>
+        </w:numPr>
+        <w:spacing w:after="60"/>
+      </w:pPr>
+      <w:r>
+        <w:rPr>
+          <w:b/>
+          <w:bCs/>
+        </w:rPr>
+        <w:t xml:space="preserve">Comprar</w:t>
+      </w:r>
+      <w:r>
+        <w:t xml:space="preserve"> no provador coloca na sacola a variação escolhida na página (cor, tamanho) e abre o carrinho.</w:t>
+      </w:r>
+    </w:p>
+    <w:p>
+      <w:pPr>
+        <w:pStyle w:val="ListParagraph"/>
+        <w:numPr>
+          <w:ilvl w:val="0"/>
+          <w:numId w:val="2"/>
+        </w:numPr>
+        <w:spacing w:after="60"/>
+      </w:pPr>
+      <w:r>
+        <w:rPr>
+          <w:b/>
+          <w:bCs/>
+        </w:rPr>
+        <w:t xml:space="preserve">Compartilhar</w:t>
+      </w:r>
+      <w:r>
+        <w:t xml:space="preserve"> gera um link com prévia para WhatsApp e redes sociais, com "Provar em mim" e "Ver produto na loja".</w:t>
+      </w:r>
+    </w:p>
+    <w:p>
+      <w:pPr>
+        <w:pStyle w:val="ListParagraph"/>
+        <w:numPr>
+          <w:ilvl w:val="0"/>
+          <w:numId w:val="2"/>
+        </w:numPr>
+        <w:spacing w:after="60"/>
+      </w:pPr>
+      <w:r>
+        <w:rPr>
+          <w:b/>
+          <w:bCs/>
+        </w:rPr>
+        <w:t xml:space="preserve">Apagar agora</w:t>
+      </w:r>
+      <w:r>
+        <w:t xml:space="preserve"> remove a foto e as provas na hora.</w:t>
+      </w:r>
+    </w:p>
+    <w:p>
+      <w:pPr>
+        <w:pStyle w:val="Heading3"/>
+      </w:pPr>
+      <w:r>
+        <w:t xml:space="preserve">No painel (lojista)</w:t>
+      </w:r>
+    </w:p>
+    <w:p>
+      <w:pPr>
+        <w:pStyle w:val="ListParagraph"/>
+        <w:numPr>
+          <w:ilvl w:val="0"/>
+          <w:numId w:val="2"/>
+        </w:numPr>
+        <w:spacing w:after="60"/>
+      </w:pPr>
+      <w:r>
+        <w:rPr>
+          <w:b/>
+          <w:bCs/>
+        </w:rPr>
+        <w:t xml:space="preserve">Visão geral:</w:t>
+      </w:r>
+      <w:r>
+        <w:t xml:space="preserve"> provas, pessoas que provaram, vendas e receita com o provador, gráfico diário, funil do botão à compra, compartilhamentos e produtos mais provados, por período (hoje, ontem, 7, 30 e 90 dias).</w:t>
+      </w:r>
+    </w:p>
+    <w:p>
+      <w:pPr>
+        <w:pStyle w:val="ListParagraph"/>
+        <w:numPr>
+          <w:ilvl w:val="0"/>
+          <w:numId w:val="2"/>
+        </w:numPr>
+        <w:spacing w:after="60"/>
+      </w:pPr>
+      <w:r>
+        <w:rPr>
+          <w:b/>
+          <w:bCs/>
+        </w:rPr>
+        <w:t xml:space="preserve">Produtos:</w:t>
+      </w:r>
+      <w:r>
+        <w:t xml:space="preserve"> tipo de cada produto (roupa ou óculos, automático) e opção de desligar o provador por produto.</w:t>
+      </w:r>
+    </w:p>
+    <w:p>
+      <w:pPr>
+        <w:pStyle w:val="ListParagraph"/>
+        <w:numPr>
+          <w:ilvl w:val="0"/>
+          <w:numId w:val="2"/>
+        </w:numPr>
+        <w:spacing w:after="60"/>
+      </w:pPr>
+      <w:r>
+        <w:rPr>
+          <w:b/>
+          <w:bCs/>
+        </w:rPr>
+        <w:t xml:space="preserve">Leads:</w:t>
+      </w:r>
+      <w:r>
+        <w:t xml:space="preserve"> WhatsApps captados, com o produto provado e exportação em CSV.</w:t>
+      </w:r>
+    </w:p>
+    <w:p>
+      <w:pPr>
+        <w:pStyle w:val="ListParagraph"/>
+        <w:numPr>
+          <w:ilvl w:val="0"/>
+          <w:numId w:val="2"/>
+        </w:numPr>
+        <w:spacing w:after="60"/>
+      </w:pPr>
+      <w:r>
+        <w:rPr>
+          <w:b/>
+          <w:bCs/>
+        </w:rPr>
+        <w:t xml:space="preserve">Preferências:</w:t>
+      </w:r>
+      <w:r>
+        <w:t xml:space="preserve"> liga/desliga o provador, texto e ícone do botão, esconder em produtos sem estoque, pedido de WhatsApp (depois de quantas provas) e limite de provas por comprador por dia.</w:t>
       </w:r>
     </w:p>
     <w:p>
@@ -1836,7 +2129,7 @@
           <wp:inline distT="0" distB="0" distL="0" distR="0">
             <wp:extent cx="5715000" cy="3571875"/>
             <wp:effectExtent t="0" r="0" b="0" l="0"/>
-            <wp:docPr id="1" name="admin-prefs.jpg" descr="Preferências: botão na loja e pedido de WhatsApp" title="Preferências: botão na loja e pedido de WhatsApp"/>
+            <wp:docPr id="1" name="admin-leads.jpg" descr="Leads: WhatsApps captados pelo provador" title="Leads: WhatsApps captados pelo provador"/>
             <wp:cNvGraphicFramePr>
               <a:graphicFrameLocks xmlns:a="http://schemas.openxmlformats.org/drawingml/2006/main" noChangeAspect="1"/>
             </wp:cNvGraphicFramePr>
@@ -1885,30 +2178,7 @@
           <w:sz w:val="18"/>
           <w:szCs w:val="18"/>
         </w:rPr>
-        <w:t xml:space="preserve">Preferências: botão na loja e pedido de WhatsApp</w:t>
-      </w:r>
-    </w:p>
-    <w:p>
-      <w:pPr>
-        <w:pStyle w:val="ListParagraph"/>
-        <w:numPr>
-          <w:ilvl w:val="0"/>
-          <w:numId w:val="4"/>
-        </w:numPr>
-        <w:spacing w:after="80"/>
-      </w:pPr>
-      <w:r>
-        <w:t xml:space="preserve">Abra um produto da sua loja: o botão </w:t>
-      </w:r>
-      <w:r>
-        <w:rPr>
-          <w:b/>
-          <w:bCs/>
-        </w:rPr>
-        <w:t xml:space="preserve">"Provar em mim"</w:t>
-      </w:r>
-      <w:r>
-        <w:t xml:space="preserve"> aparece abaixo do "Comprar". Faça uma prova para conferir.</w:t>
+        <w:t xml:space="preserve">Leads: WhatsApps captados pelo provador</w:t>
       </w:r>
     </w:p>
     <w:p>
@@ -1916,7 +2186,7 @@
         <w:pStyle w:val="Heading3"/>
       </w:pPr>
       <w:r>
-        <w:t xml:space="preserve">3.5.3. Direcionamento para o suporte do aplicativo</w:t>
+        <w:t xml:space="preserve">Como a venda é atribuída ao provador</w:t>
       </w:r>
     </w:p>
     <w:p>
@@ -1924,37 +2194,7 @@
         <w:spacing w:after="120"/>
       </w:pPr>
       <w:r>
-        <w:t xml:space="preserve">Dúvidas na instalação: e-mail </w:t>
-      </w:r>
-      <w:r>
-        <w:rPr>
-          <w:b/>
-          <w:bCs/>
-        </w:rPr>
-        <w:t xml:space="preserve">suporte@miaou.com.br</w:t>
-      </w:r>
-      <w:r>
-        <w:t xml:space="preserve"> ou telefone </w:t>
-      </w:r>
-      <w:r>
-        <w:rPr>
-          <w:b/>
-          <w:bCs/>
-        </w:rPr>
-        <w:t xml:space="preserve">(21) 97550-3749</w:t>
-      </w:r>
-      <w:r>
-        <w:t xml:space="preserve">, de segunda a sexta, das 9h às 18h, com resposta em até 24 horas. No painel, o botão </w:t>
-      </w:r>
-      <w:r>
-        <w:rPr>
-          <w:b/>
-          <w:bCs/>
-        </w:rPr>
-        <w:t xml:space="preserve">Falar com a Miaou</w:t>
-      </w:r>
-      <w:r>
-        <w:t xml:space="preserve"> abre o e-mail já com o número da loja.</w:t>
+        <w:t xml:space="preserve">Quando a prova fica pronta, o navegador do comprador guarda (por 7 dias) que aquele produto foi provado. Ao finalizar a compra, o script do checkout informa o pedido ao Miaou. A venda só conta quando a Nuvemshop confirma o pagamento (webhook order/paid) e o produto provado está no pedido, em qualquer tamanho ou cor.</w:t>
       </w:r>
     </w:p>
     <w:p>
@@ -1962,446 +2202,6 @@
         <w:pStyle w:val="Heading3"/>
       </w:pPr>
       <w:r>
-        <w:t xml:space="preserve">3.5.4. Considerações Gerais</w:t>
-      </w:r>
-    </w:p>
-    <w:p>
-      <w:pPr>
-        <w:pStyle w:val="ListParagraph"/>
-        <w:numPr>
-          <w:ilvl w:val="0"/>
-          <w:numId w:val="2"/>
-        </w:numPr>
-        <w:spacing w:after="60"/>
-      </w:pPr>
-      <w:r>
-        <w:rPr>
-          <w:b/>
-          <w:bCs/>
-        </w:rPr>
-        <w:t xml:space="preserve">O botão não apareceu:</w:t>
-      </w:r>
-      <w:r>
-        <w:t xml:space="preserve"> confira se há plano ativo em Planos, se o provador está ligado em Preferências e se o produto tem foto.</w:t>
-      </w:r>
-    </w:p>
-    <w:p>
-      <w:pPr>
-        <w:pStyle w:val="ListParagraph"/>
-        <w:numPr>
-          <w:ilvl w:val="0"/>
-          <w:numId w:val="2"/>
-        </w:numPr>
-        <w:spacing w:after="60"/>
-      </w:pPr>
-      <w:r>
-        <w:rPr>
-          <w:b/>
-          <w:bCs/>
-        </w:rPr>
-        <w:t xml:space="preserve">Loja com domínio próprio novo:</w:t>
-      </w:r>
-      <w:r>
-        <w:t xml:space="preserve"> abra o painel do Miaou uma vez para ele atualizar os endereços da loja.</w:t>
-      </w:r>
-    </w:p>
-    <w:p>
-      <w:pPr>
-        <w:pStyle w:val="ListParagraph"/>
-        <w:numPr>
-          <w:ilvl w:val="0"/>
-          <w:numId w:val="2"/>
-        </w:numPr>
-        <w:spacing w:after="60"/>
-      </w:pPr>
-      <w:r>
-        <w:rPr>
-          <w:b/>
-          <w:bCs/>
-        </w:rPr>
-        <w:t xml:space="preserve">"Sessão expirada" no painel:</w:t>
-      </w:r>
-      <w:r>
-        <w:t xml:space="preserve"> abra o app de novo pelo admin da Nuvemshop (Meus aplicativos &gt; Miaou).</w:t>
-      </w:r>
-    </w:p>
-    <w:p>
-      <w:pPr>
-        <w:pStyle w:val="ListParagraph"/>
-        <w:numPr>
-          <w:ilvl w:val="0"/>
-          <w:numId w:val="2"/>
-        </w:numPr>
-        <w:spacing w:after="60"/>
-      </w:pPr>
-      <w:r>
-        <w:rPr>
-          <w:b/>
-          <w:bCs/>
-        </w:rPr>
-        <w:t xml:space="preserve">Produto novo não aparece em Produtos:</w:t>
-      </w:r>
-      <w:r>
-        <w:t xml:space="preserve"> ele chega sozinho em alguns segundos; se não chegar, use Sincronizar catálogo.</w:t>
-      </w:r>
-    </w:p>
-    <w:p>
-      <w:pPr>
-        <w:pStyle w:val="ListParagraph"/>
-        <w:numPr>
-          <w:ilvl w:val="0"/>
-          <w:numId w:val="2"/>
-        </w:numPr>
-        <w:spacing w:after="60"/>
-      </w:pPr>
-      <w:r>
-        <w:rPr>
-          <w:b/>
-          <w:bCs/>
-        </w:rPr>
-        <w:t xml:space="preserve">Desinstalação:</w:t>
-      </w:r>
-      <w:r>
-        <w:t xml:space="preserve"> em Meus aplicativos, clique em Desinstalar. O botão sai da loja na hora. Ao reinstalar, o histórico e as preferências voltam.</w:t>
-      </w:r>
-    </w:p>
-    <w:p>
-      <w:pPr>
-        <w:pStyle w:val="Heading1"/>
-      </w:pPr>
-      <w:r>
-        <w:t xml:space="preserve">4. Funcionamento</w:t>
-      </w:r>
-    </w:p>
-    <w:p>
-      <w:pPr>
-        <w:pStyle w:val="Heading2"/>
-      </w:pPr>
-      <w:r>
-        <w:t xml:space="preserve">4.1. Como a ferramenta funciona: configuração e funcionalidades</w:t>
-      </w:r>
-    </w:p>
-    <w:p>
-      <w:pPr>
-        <w:pStyle w:val="Heading3"/>
-      </w:pPr>
-      <w:r>
-        <w:t xml:space="preserve">Na loja (comprador)</w:t>
-      </w:r>
-    </w:p>
-    <w:p>
-      <w:pPr>
-        <w:pStyle w:val="ListParagraph"/>
-        <w:numPr>
-          <w:ilvl w:val="0"/>
-          <w:numId w:val="2"/>
-        </w:numPr>
-        <w:spacing w:after="60"/>
-      </w:pPr>
-      <w:r>
-        <w:t xml:space="preserve">Botão </w:t>
-      </w:r>
-      <w:r>
-        <w:rPr>
-          <w:b/>
-          <w:bCs/>
-        </w:rPr>
-        <w:t xml:space="preserve">"Provar em mim"</w:t>
-      </w:r>
-      <w:r>
-        <w:t xml:space="preserve"> abaixo do "Comprar", em qualquer layout. No celular, o provador abre em janela; no computador, em gaveta lateral.</w:t>
-      </w:r>
-    </w:p>
-    <w:p>
-      <w:pPr>
-        <w:pStyle w:val="ListParagraph"/>
-        <w:numPr>
-          <w:ilvl w:val="0"/>
-          <w:numId w:val="2"/>
-        </w:numPr>
-        <w:spacing w:after="60"/>
-      </w:pPr>
-      <w:r>
-        <w:t xml:space="preserve">O comprador envia uma foto ou tira na hora (câmera traseira para roupas, selfie para óculos). A foto é reduzida no próprio aparelho antes do envio.</w:t>
-      </w:r>
-    </w:p>
-    <w:p>
-      <w:pPr>
-        <w:pStyle w:val="ListParagraph"/>
-        <w:numPr>
-          <w:ilvl w:val="0"/>
-          <w:numId w:val="2"/>
-        </w:numPr>
-        <w:spacing w:after="60"/>
-      </w:pPr>
-      <w:r>
-        <w:t xml:space="preserve">A prova fica pronta em cerca de 20 segundos, com o rosto e o fundo da foto original.</w:t>
-      </w:r>
-    </w:p>
-    <w:p>
-      <w:pPr>
-        <w:pStyle w:val="ListParagraph"/>
-        <w:numPr>
-          <w:ilvl w:val="0"/>
-          <w:numId w:val="2"/>
-        </w:numPr>
-        <w:spacing w:after="60"/>
-      </w:pPr>
-      <w:r>
-        <w:t xml:space="preserve">A foto fica guardada por 24 horas: a segunda peça já começa sem novo envio.</w:t>
-      </w:r>
-    </w:p>
-    <w:p>
-      <w:pPr>
-        <w:pStyle w:val="ListParagraph"/>
-        <w:numPr>
-          <w:ilvl w:val="0"/>
-          <w:numId w:val="2"/>
-        </w:numPr>
-        <w:spacing w:after="60"/>
-      </w:pPr>
-      <w:r>
-        <w:rPr>
-          <w:b/>
-          <w:bCs/>
-        </w:rPr>
-        <w:t xml:space="preserve">Comprar</w:t>
-      </w:r>
-      <w:r>
-        <w:t xml:space="preserve"> no provador coloca na sacola a variação escolhida na página (cor, tamanho) e abre o carrinho.</w:t>
-      </w:r>
-    </w:p>
-    <w:p>
-      <w:pPr>
-        <w:pStyle w:val="ListParagraph"/>
-        <w:numPr>
-          <w:ilvl w:val="0"/>
-          <w:numId w:val="2"/>
-        </w:numPr>
-        <w:spacing w:after="60"/>
-      </w:pPr>
-      <w:r>
-        <w:rPr>
-          <w:b/>
-          <w:bCs/>
-        </w:rPr>
-        <w:t xml:space="preserve">Compartilhar</w:t>
-      </w:r>
-      <w:r>
-        <w:t xml:space="preserve"> gera um link com prévia para WhatsApp e redes sociais, com "Provar em mim" e "Ver produto na loja".</w:t>
-      </w:r>
-    </w:p>
-    <w:p>
-      <w:pPr>
-        <w:pStyle w:val="ListParagraph"/>
-        <w:numPr>
-          <w:ilvl w:val="0"/>
-          <w:numId w:val="2"/>
-        </w:numPr>
-        <w:spacing w:after="60"/>
-      </w:pPr>
-      <w:r>
-        <w:rPr>
-          <w:b/>
-          <w:bCs/>
-        </w:rPr>
-        <w:t xml:space="preserve">Apagar agora</w:t>
-      </w:r>
-      <w:r>
-        <w:t xml:space="preserve"> remove a foto e as provas na hora.</w:t>
-      </w:r>
-    </w:p>
-    <w:p>
-      <w:pPr>
-        <w:pStyle w:val="Heading3"/>
-      </w:pPr>
-      <w:r>
-        <w:t xml:space="preserve">No painel (lojista)</w:t>
-      </w:r>
-    </w:p>
-    <w:p>
-      <w:pPr>
-        <w:pStyle w:val="ListParagraph"/>
-        <w:numPr>
-          <w:ilvl w:val="0"/>
-          <w:numId w:val="2"/>
-        </w:numPr>
-        <w:spacing w:after="60"/>
-      </w:pPr>
-      <w:r>
-        <w:rPr>
-          <w:b/>
-          <w:bCs/>
-        </w:rPr>
-        <w:t xml:space="preserve">Visão geral:</w:t>
-      </w:r>
-      <w:r>
-        <w:t xml:space="preserve"> provas, pessoas que provaram, vendas e receita com o provador, gráfico diário, funil do botão à compra, compartilhamentos e produtos mais provados, por período (hoje, ontem, 7, 30 e 90 dias).</w:t>
-      </w:r>
-    </w:p>
-    <w:p>
-      <w:pPr>
-        <w:pStyle w:val="ListParagraph"/>
-        <w:numPr>
-          <w:ilvl w:val="0"/>
-          <w:numId w:val="2"/>
-        </w:numPr>
-        <w:spacing w:after="60"/>
-      </w:pPr>
-      <w:r>
-        <w:rPr>
-          <w:b/>
-          <w:bCs/>
-        </w:rPr>
-        <w:t xml:space="preserve">Produtos:</w:t>
-      </w:r>
-      <w:r>
-        <w:t xml:space="preserve"> tipo de cada produto (roupa ou óculos, automático) e opção de desligar o provador por produto.</w:t>
-      </w:r>
-    </w:p>
-    <w:p>
-      <w:pPr>
-        <w:pStyle w:val="ListParagraph"/>
-        <w:numPr>
-          <w:ilvl w:val="0"/>
-          <w:numId w:val="2"/>
-        </w:numPr>
-        <w:spacing w:after="60"/>
-      </w:pPr>
-      <w:r>
-        <w:rPr>
-          <w:b/>
-          <w:bCs/>
-        </w:rPr>
-        <w:t xml:space="preserve">Leads:</w:t>
-      </w:r>
-      <w:r>
-        <w:t xml:space="preserve"> WhatsApps captados, com o produto provado e exportação em CSV.</w:t>
-      </w:r>
-    </w:p>
-    <w:p>
-      <w:pPr>
-        <w:pStyle w:val="ListParagraph"/>
-        <w:numPr>
-          <w:ilvl w:val="0"/>
-          <w:numId w:val="2"/>
-        </w:numPr>
-        <w:spacing w:after="60"/>
-      </w:pPr>
-      <w:r>
-        <w:rPr>
-          <w:b/>
-          <w:bCs/>
-        </w:rPr>
-        <w:t xml:space="preserve">Planos:</w:t>
-      </w:r>
-      <w:r>
-        <w:t xml:space="preserve"> plano ativo, uso do mês e aviso aos 80% da cota.</w:t>
-      </w:r>
-    </w:p>
-    <w:p>
-      <w:pPr>
-        <w:pStyle w:val="ListParagraph"/>
-        <w:numPr>
-          <w:ilvl w:val="0"/>
-          <w:numId w:val="2"/>
-        </w:numPr>
-        <w:spacing w:after="60"/>
-      </w:pPr>
-      <w:r>
-        <w:rPr>
-          <w:b/>
-          <w:bCs/>
-        </w:rPr>
-        <w:t xml:space="preserve">Preferências:</w:t>
-      </w:r>
-      <w:r>
-        <w:t xml:space="preserve"> liga/desliga o provador, texto e ícone do botão, esconder em produtos sem estoque, pedido de WhatsApp (depois de quantas provas) e limite de provas por comprador por dia.</w:t>
-      </w:r>
-    </w:p>
-    <w:p>
-      <w:pPr>
-        <w:spacing w:before="120"/>
-        <w:jc w:val="center"/>
-      </w:pPr>
-      <w:r>
-        <w:drawing>
-          <wp:inline distT="0" distB="0" distL="0" distR="0">
-            <wp:extent cx="5715000" cy="3571875"/>
-            <wp:effectExtent t="0" r="0" b="0" l="0"/>
-            <wp:docPr id="1" name="admin-leads.jpg" descr="Leads: WhatsApps captados pelo provador" title="Leads: WhatsApps captados pelo provador"/>
-            <wp:cNvGraphicFramePr>
-              <a:graphicFrameLocks xmlns:a="http://schemas.openxmlformats.org/drawingml/2006/main" noChangeAspect="1"/>
-            </wp:cNvGraphicFramePr>
-            <a:graphic xmlns:a="http://schemas.openxmlformats.org/drawingml/2006/main">
-              <a:graphicData uri="http://schemas.openxmlformats.org/drawingml/2006/picture">
-                <pic:pic xmlns:pic="http://schemas.openxmlformats.org/drawingml/2006/picture">
-                  <pic:nvPicPr>
-                    <pic:cNvPr id="0" name="" descr=""/>
-                    <pic:cNvPicPr>
-                      <a:picLocks noChangeAspect="1" noChangeArrowheads="1"/>
-                    </pic:cNvPicPr>
-                  </pic:nvPicPr>
-                  <pic:blipFill>
-                    <a:blip r:embed="rId13" cstate="none"/>
-                    <a:srcRect/>
-                    <a:stretch>
-                      <a:fillRect/>
-                    </a:stretch>
-                  </pic:blipFill>
-                  <pic:spPr bwMode="auto">
-                    <a:xfrm>
-                      <a:off x="0" y="0"/>
-                      <a:ext cx="5715000" cy="3571875"/>
-                    </a:xfrm>
-                    <a:prstGeom prst="rect">
-                      <a:avLst/>
-                    </a:prstGeom>
-                  </pic:spPr>
-                </pic:pic>
-              </a:graphicData>
-            </a:graphic>
-          </wp:inline>
-        </w:drawing>
-      </w:r>
-    </w:p>
-    <w:p>
-      <w:pPr>
-        <w:spacing w:after="200"/>
-        <w:jc w:val="center"/>
-      </w:pPr>
-      <w:r>
-        <w:rPr>
-          <w:i/>
-          <w:iCs/>
-          <w:color w:val="666666"/>
-          <w:sz w:val="18"/>
-          <w:szCs w:val="18"/>
-        </w:rPr>
-        <w:t xml:space="preserve">Leads: WhatsApps captados pelo provador</w:t>
-      </w:r>
-    </w:p>
-    <w:p>
-      <w:pPr>
-        <w:pStyle w:val="Heading3"/>
-      </w:pPr>
-      <w:r>
-        <w:t xml:space="preserve">Como a venda é atribuída ao provador</w:t>
-      </w:r>
-    </w:p>
-    <w:p>
-      <w:pPr>
-        <w:spacing w:after="120"/>
-      </w:pPr>
-      <w:r>
-        <w:t xml:space="preserve">Quando a prova fica pronta, o navegador do comprador guarda (por 7 dias) que aquele produto foi provado. Ao finalizar a compra, o script do checkout informa o pedido ao Miaou. A venda só conta quando a Nuvemshop confirma o pagamento (webhook order/paid) e o produto provado está no pedido, em qualquer tamanho ou cor.</w:t>
-      </w:r>
-    </w:p>
-    <w:p>
-      <w:pPr>
-        <w:pStyle w:val="Heading3"/>
-      </w:pPr>
-      <w:r>
         <w:t xml:space="preserve">Proteções e privacidade</w:t>
       </w:r>
     </w:p>
@@ -2428,7 +2228,7 @@
         <w:spacing w:after="60"/>
       </w:pPr>
       <w:r>
-        <w:t xml:space="preserve">A mesma foto no mesmo produto devolve a prova já feita, sem gastar cota.</w:t>
+        <w:t xml:space="preserve">A mesma foto no mesmo produto devolve a prova já feita, sem gerar de novo.</w:t>
       </w:r>
     </w:p>
     <w:p>

</xml_diff>

<commit_message>
Homologação: imagens 1920x1080 da loja de apps e posição correta do botão
Co-Authored-By: Claude Opus 5.5 <noreply@anthropic.com>
Claude-Session: https://claude.ai/code/session_01LGkq3braMSrM85FQCLA9We
</commit_message>
<xml_diff>
--- a/homologacao/04-faq-template-nuvemshop.docx
+++ b/homologacao/04-faq-template-nuvemshop.docx
@@ -121,7 +121,7 @@
         <w:t xml:space="preserve">"Provar em mim"</w:t>
       </w:r>
       <w:r>
-        <w:t xml:space="preserve"> na página do produto, logo abaixo do "Comprar". O comprador envia uma foto e, em cerca de 20 segundos, vê a peça ou os óculos no próprio corpo, mantendo o rosto e o fundo da foto dele. Ele pode comprar direto pelo provador e compartilhar a prova.</w:t>
+        <w:t xml:space="preserve"> na página do produto, perto do botão "Comprar". O comprador envia uma foto e, em cerca de 20 segundos, vê a peça ou os óculos no próprio corpo, mantendo o rosto e o fundo da foto dele. Ele pode comprar direto pelo provador e compartilhar a prova.</w:t>
       </w:r>
     </w:p>
     <w:p>
@@ -1728,7 +1728,7 @@
         <w:t xml:space="preserve">"Provar em mim"</w:t>
       </w:r>
       <w:r>
-        <w:t xml:space="preserve"> aparece abaixo do "Comprar". Faça uma prova para conferir.</w:t>
+        <w:t xml:space="preserve"> aparece perto do botão "Comprar". Faça uma prova para conferir.</w:t>
       </w:r>
     </w:p>
     <w:p>
@@ -1929,7 +1929,7 @@
         <w:t xml:space="preserve">"Provar em mim"</w:t>
       </w:r>
       <w:r>
-        <w:t xml:space="preserve"> abaixo do "Comprar", em qualquer layout. No celular, o provador abre em janela; no computador, em gaveta lateral.</w:t>
+        <w:t xml:space="preserve"> na página do produto, perto do "Comprar", em qualquer layout. No celular, o provador abre em janela; no computador, em gaveta lateral.</w:t>
       </w:r>
     </w:p>
     <w:p>

</xml_diff>

<commit_message>
Homologação: remove o tempo da prova dos textos
Co-Authored-By: Claude Opus 5.5 <noreply@anthropic.com>
Claude-Session: https://claude.ai/code/session_01LGkq3braMSrM85FQCLA9We
</commit_message>
<xml_diff>
--- a/homologacao/04-faq-template-nuvemshop.docx
+++ b/homologacao/04-faq-template-nuvemshop.docx
@@ -121,7 +121,7 @@
         <w:t xml:space="preserve">"Provar em mim"</w:t>
       </w:r>
       <w:r>
-        <w:t xml:space="preserve"> na página do produto, perto do botão "Comprar". O comprador envia uma foto e, em cerca de 20 segundos, vê a peça ou os óculos no próprio corpo, mantendo o rosto e o fundo da foto dele. Ele pode comprar direto pelo provador e compartilhar a prova.</w:t>
+        <w:t xml:space="preserve"> na página do produto, perto do botão "Comprar". O comprador envia uma foto e vê a peça ou os óculos no próprio corpo, mantendo o rosto e o fundo da foto dele. Ele pode comprar direto pelo provador e compartilhar a prova.</w:t>
       </w:r>
     </w:p>
     <w:p>
@@ -1955,7 +1955,7 @@
         <w:spacing w:after="60"/>
       </w:pPr>
       <w:r>
-        <w:t xml:space="preserve">A prova fica pronta em cerca de 20 segundos, com o rosto e o fundo da foto original.</w:t>
+        <w:t xml:space="preserve">A prova mantém o rosto e o fundo da foto original.</w:t>
       </w:r>
     </w:p>
     <w:p>

</xml_diff>

<commit_message>
Homologação: remove a opção de liberar a loja da equipe; textos mais diretos
Co-Authored-By: Claude Opus 5.5 <noreply@anthropic.com>
Claude-Session: https://claude.ai/code/session_01LGkq3braMSrM85FQCLA9We
</commit_message>
<xml_diff>
--- a/homologacao/04-faq-template-nuvemshop.docx
+++ b/homologacao/04-faq-template-nuvemshop.docx
@@ -950,47 +950,7 @@
         <w:spacing w:after="120"/>
       </w:pPr>
       <w:r>
-        <w:t xml:space="preserve">Sim. Há duas opções:</w:t>
-      </w:r>
-    </w:p>
-    <w:p>
-      <w:pPr>
-        <w:pStyle w:val="ListParagraph"/>
-        <w:numPr>
-          <w:ilvl w:val="0"/>
-          <w:numId w:val="2"/>
-        </w:numPr>
-        <w:spacing w:after="60"/>
-      </w:pPr>
-      <w:r>
-        <w:rPr>
-          <w:b/>
-          <w:bCs/>
-        </w:rPr>
-        <w:t xml:space="preserve">Loja de demonstração</w:t>
-      </w:r>
-      <w:r>
-        <w:t xml:space="preserve"> com o Miaou instalado e já liberado: https://lojademo317.lojavirtualnuvem.com.br/ . O acesso ao admin é enviado junto com os artefatos de homologação. Produtos para testar: Polo Tricot, CALÇA BLAIR UVA e Óculos de Grau Michael Kors MK4103U - Preto.</w:t>
-      </w:r>
-    </w:p>
-    <w:p>
-      <w:pPr>
-        <w:pStyle w:val="ListParagraph"/>
-        <w:numPr>
-          <w:ilvl w:val="0"/>
-          <w:numId w:val="2"/>
-        </w:numPr>
-        <w:spacing w:after="60"/>
-      </w:pPr>
-      <w:r>
-        <w:rPr>
-          <w:b/>
-          <w:bCs/>
-        </w:rPr>
-        <w:t xml:space="preserve">Na loja da equipe Nuvemshop:</w:t>
-      </w:r>
-      <w:r>
-        <w:t xml:space="preserve"> depois de instalar o Miaou, envie o ID da loja para suporte@miaou.com.br e liberamos o provador sem custo em até 24 horas.</w:t>
+        <w:t xml:space="preserve">Sim. A loja de demonstração https://lojademo317.lojavirtualnuvem.com.br/ já está com o Miaou instalado e o plano ativo. O acesso ao admin é enviado junto com os artefatos de homologação. Produtos para testar: Polo Tricot, CALÇA BLAIR UVA e Óculos de Grau Michael Kors MK4103U - Preto.</w:t>
       </w:r>
     </w:p>
     <w:p>

</xml_diff>